<commit_message>
Update mentor guide for prebuilt Docker images
</commit_message>
<xml_diff>
--- a/docs/TSD_Engine_Installation_Guide_Mentor.docx
+++ b/docs/TSD_Engine_Installation_Guide_Mentor.docx
@@ -2879,7 +2879,7 @@
                 <w:sz w:val="19"/>
               </w:rPr>
               <w:br/>
-              <w:t>Service hanya dapat dibangun jika Docker daemon sudah berjalan.</w:t>
+              <w:t>Image prebuilt hanya dapat ditarik dan dijalankan jika Docker Desktop atau Docker Engine sudah aktif.</w:t>
             </w:r>
           </w:p>
         </w:tc>
@@ -3393,7 +3393,7 @@
                 <w:color w:val="12344D"/>
                 <w:sz w:val="24"/>
               </w:rPr>
-              <w:t>Build dan jalankan seluruh service</w:t>
+              <w:t>Tarik image prebuilt dan jalankan service</w:t>
             </w:r>
             <w:r>
               <w:rPr>
@@ -3401,7 +3401,7 @@
                 <w:sz w:val="19"/>
               </w:rPr>
               <w:br/>
-              <w:t>Docker Compose membangun image project dan menyalakan frontend, backend, documentserver, serta Ollama menggunakan volume yang sudah dipulihkan.</w:t>
+              <w:t>Gunakan image frontend/backend yang telah dibangun oleh GitHub Actions. Jalur ini tidak menjalankan npm install, pip install, apt, atau build source code di laptop penerima.</w:t>
             </w:r>
           </w:p>
         </w:tc>
@@ -3444,13 +3444,20 @@
               <w:right w:w="110" w:type="dxa"/>
             </w:tcMar>
           </w:tcPr>
-          <w:p/>
           <w:p>
             <w:pPr>
               <w:pStyle w:val="CodeBlock"/>
             </w:pPr>
             <w:r>
-              <w:t>docker compose up -d --build</w:t>
+              <w:t>docker compose -f compose.prebuilt.yaml pull</w:t>
+            </w:r>
+          </w:p>
+          <w:p>
+            <w:pPr>
+              <w:pStyle w:val="CodeBlock"/>
+            </w:pPr>
+            <w:r>
+              <w:t>docker compose -f compose.prebuilt.yaml up -d</w:t>
             </w:r>
           </w:p>
         </w:tc>
@@ -3467,7 +3474,7 @@
         <w:ind w:left="216"/>
       </w:pPr>
       <w:r>
-        <w:t>Lakukan: Tunggu build selesai. Startup pertama dapat lebih lama ketika image diunduh dan layanan memuat volume hasil restore.</w:t>
+        <w:t>Lakukan: Tunggu proses pull dan startup selesai. Image frontend/backend tidak dibangun di laptop penerima. Startup pertama dapat lebih lama karena image perlu diunduh dan volume hasil restore dimuat.</w:t>
       </w:r>
     </w:p>
     <w:p>
@@ -3475,14 +3482,7 @@
         <w:ind w:left="216"/>
       </w:pPr>
       <w:r>
-        <w:rPr>
-          <w:b/>
-          <w:color w:val="00875A"/>
-        </w:rPr>
-        <w:t xml:space="preserve">Hasil yang diharapkan: </w:t>
-      </w:r>
-      <w:r>
-        <w:t>Command selesai tanpa error fatal dan container project mulai berjalan di background.</w:t>
+        <w:t>Hasil yang diharapkan: Image berhasil ditarik dan seluruh container mulai berjalan di background tanpa error build npm/pip.</w:t>
       </w:r>
     </w:p>
     <w:tbl>
@@ -3558,7 +3558,7 @@
                 <w:sz w:val="19"/>
               </w:rPr>
               <w:br/>
-              <w:t>Pastikan semua service utama sudah berjalan sebelum membuka aplikasi.</w:t>
+              <w:t>Pastikan frontend, backend, documentserver, dan ollama sudah berjalan sebelum membuka aplikasi.</w:t>
             </w:r>
           </w:p>
         </w:tc>
@@ -3601,13 +3601,12 @@
               <w:right w:w="110" w:type="dxa"/>
             </w:tcMar>
           </w:tcPr>
-          <w:p/>
           <w:p>
             <w:pPr>
               <w:pStyle w:val="CodeBlock"/>
             </w:pPr>
             <w:r>
-              <w:t>docker compose ps</w:t>
+              <w:t>docker compose -f compose.prebuilt.yaml ps</w:t>
             </w:r>
           </w:p>
         </w:tc>
@@ -3624,7 +3623,7 @@
         <w:ind w:left="216"/>
       </w:pPr>
       <w:r>
-        <w:t>Lakukan: Periksa baris frontend, backend, documentserver, dan ollama. Jika ada service Exit/Restarting, jangan lanjut ke Step 10 sebelum log service tersebut diperiksa.</w:t>
+        <w:t>Lakukan: Periksa frontend, backend, documentserver, dan ollama. Jika ada service Exit/Restarting, periksa log sebelum melanjutkan Step 10.</w:t>
       </w:r>
     </w:p>
     <w:p>
@@ -3758,13 +3757,12 @@
               <w:right w:w="110" w:type="dxa"/>
             </w:tcMar>
           </w:tcPr>
-          <w:p/>
           <w:p>
             <w:pPr>
               <w:pStyle w:val="CodeBlock"/>
             </w:pPr>
             <w:r>
-              <w:t>docker compose exec ollama ollama list</w:t>
+              <w:t>docker compose -f compose.prebuilt.yaml exec ollama ollama list</w:t>
             </w:r>
           </w:p>
         </w:tc>
@@ -3915,13 +3913,12 @@
               <w:right w:w="110" w:type="dxa"/>
             </w:tcMar>
           </w:tcPr>
-          <w:p/>
           <w:p>
             <w:pPr>
               <w:pStyle w:val="CodeBlock"/>
             </w:pPr>
             <w:r>
-              <w:t>docker compose logs -f backend documentserver ollama</w:t>
+              <w:t>docker compose -f compose.prebuilt.yaml logs -f backend documentserver ollama</w:t>
             </w:r>
           </w:p>
         </w:tc>
@@ -5042,7 +5039,7 @@
                 <w:color w:val="12344D"/>
                 <w:sz w:val="24"/>
               </w:rPr>
-              <w:t>Update aplikasi dari private Git</w:t>
+              <w:t>Update aplikasi dari GitHub</w:t>
             </w:r>
             <w:r>
               <w:rPr>
@@ -5050,7 +5047,7 @@
                 <w:sz w:val="19"/>
               </w:rPr>
               <w:br/>
-              <w:t>Koordinasikan backup data sesuai prosedur perusahaan sebelum memperbarui aplikasi.</w:t>
+              <w:t>Tarik source dan image prebuilt terbaru. Perintah ini memperbarui aplikasi tanpa build lokal dan tetap menggunakan Docker volumes yang ada.</w:t>
             </w:r>
           </w:p>
         </w:tc>
@@ -5093,13 +5090,12 @@
               <w:right w:w="110" w:type="dxa"/>
             </w:tcMar>
           </w:tcPr>
-          <w:p/>
           <w:p>
             <w:pPr>
               <w:pStyle w:val="CodeBlock"/>
             </w:pPr>
             <w:r>
-              <w:t>git pull</w:t>
+              <w:t>git pull origin main</w:t>
             </w:r>
           </w:p>
           <w:p>
@@ -5107,7 +5103,7 @@
               <w:pStyle w:val="CodeBlock"/>
             </w:pPr>
             <w:r>
-              <w:t>docker compose up -d --build</w:t>
+              <w:t>docker compose -f compose.prebuilt.yaml pull</w:t>
             </w:r>
           </w:p>
           <w:p>
@@ -5115,7 +5111,15 @@
               <w:pStyle w:val="CodeBlock"/>
             </w:pPr>
             <w:r>
-              <w:t>docker compose ps</w:t>
+              <w:t>docker compose -f compose.prebuilt.yaml up -d</w:t>
+            </w:r>
+          </w:p>
+          <w:p>
+            <w:pPr>
+              <w:pStyle w:val="CodeBlock"/>
+            </w:pPr>
+            <w:r>
+              <w:t>docker compose -f compose.prebuilt.yaml ps</w:t>
             </w:r>
           </w:p>
         </w:tc>
@@ -5132,7 +5136,7 @@
         <w:ind w:left="216"/>
       </w:pPr>
       <w:r>
-        <w:t>Lakukan: Gunakan release tag bila tersedia agar versi deployment dapat dilacak. Sebelum update berikutnya, minta prosedur backup internal perusahaan.</w:t>
+        <w:t>Lakukan: Pastikan Git pull dan image pull berhasil sebelum restart. Sebelum update berikutnya, ikuti prosedur backup data perusahaan.</w:t>
       </w:r>
     </w:p>
     <w:tbl>
@@ -5289,7 +5293,7 @@
           </w:tcPr>
           <w:p>
             <w:r>
-              <w:t>docker compose up -d</w:t>
+              <w:t>docker compose -f compose.prebuilt.yaml up -d</w:t>
             </w:r>
           </w:p>
         </w:tc>
@@ -5327,7 +5331,7 @@
           </w:tcPr>
           <w:p>
             <w:r>
-              <w:t>docker compose ps</w:t>
+              <w:t>docker compose -f compose.prebuilt.yaml ps</w:t>
             </w:r>
           </w:p>
         </w:tc>
@@ -5365,7 +5369,7 @@
           </w:tcPr>
           <w:p>
             <w:r>
-              <w:t>docker compose logs -f frontend backend documentserver ollama</w:t>
+              <w:t>docker compose -f compose.prebuilt.yaml logs -f frontend backend documentserver ollama</w:t>
             </w:r>
           </w:p>
         </w:tc>
@@ -5403,7 +5407,7 @@
           </w:tcPr>
           <w:p>
             <w:r>
-              <w:t>docker compose restart</w:t>
+              <w:t>docker compose -f compose.prebuilt.yaml restart</w:t>
             </w:r>
           </w:p>
         </w:tc>
@@ -5441,7 +5445,7 @@
           </w:tcPr>
           <w:p>
             <w:r>
-              <w:t>docker compose stop</w:t>
+              <w:t>docker compose -f compose.prebuilt.yaml stop</w:t>
             </w:r>
           </w:p>
         </w:tc>
@@ -5792,6 +5796,28 @@
           <w:p>
             <w:r>
               <w:t>Periksa nama volume dan isi arsip backup; jangan membuat volume kosong setelah restore selesai.</w:t>
+            </w:r>
+          </w:p>
+        </w:tc>
+      </w:tr>
+      <w:tr>
+        <w:tc>
+          <w:tcPr>
+            <w:tcW w:type="dxa" w:w="3024"/>
+          </w:tcPr>
+          <w:p>
+            <w:r>
+              <w:t>Build lokal gagal pada npm/pip</w:t>
+            </w:r>
+          </w:p>
+        </w:tc>
+        <w:tc>
+          <w:tcPr>
+            <w:tcW w:type="dxa" w:w="6624"/>
+          </w:tcPr>
+          <w:p>
+            <w:r>
+              <w:t>Jangan gunakan --build. Jalankan docker compose -f compose.prebuilt.yaml pull lalu up -d.</w:t>
             </w:r>
           </w:p>
         </w:tc>

</xml_diff>

<commit_message>
Add multi-bank source management and secure login
</commit_message>
<xml_diff>
--- a/docs/TSD_Engine_Installation_Guide_Mentor.docx
+++ b/docs/TSD_Engine_Installation_Guide_Mentor.docx
@@ -433,102 +433,6 @@
           </w:p>
         </w:tc>
       </w:tr>
-      <w:tr>
-        <w:trPr>
-          <w:jc w:val="center"/>
-        </w:trPr>
-        <w:tc>
-          <w:tcPr>
-            <w:tcW w:w="720" w:type="dxa"/>
-            <w:tcBorders>
-              <w:bottom w:val="single" w:sz="4" w:space="0" w:color="E4EAF0"/>
-            </w:tcBorders>
-            <w:shd w:val="clear" w:color="auto" w:fill="0072BC"/>
-            <w:tcMar>
-              <w:top w:w="80" w:type="dxa"/>
-              <w:left w:w="100" w:type="dxa"/>
-              <w:bottom w:w="80" w:type="dxa"/>
-              <w:right w:w="100" w:type="dxa"/>
-            </w:tcMar>
-          </w:tcPr>
-          <w:p>
-            <w:r>
-              <w:rPr>
-                <w:b/>
-                <w:color w:val="FFFFFF"/>
-              </w:rPr>
-              <w:t>C</w:t>
-            </w:r>
-          </w:p>
-        </w:tc>
-        <w:tc>
-          <w:tcPr>
-            <w:tcW w:w="9360" w:type="dxa"/>
-            <w:tcBorders>
-              <w:bottom w:val="single" w:sz="4" w:space="0" w:color="E4EAF0"/>
-            </w:tcBorders>
-            <w:tcMar>
-              <w:top w:w="80" w:type="dxa"/>
-              <w:left w:w="100" w:type="dxa"/>
-              <w:bottom w:w="80" w:type="dxa"/>
-              <w:right w:w="100" w:type="dxa"/>
-            </w:tcMar>
-          </w:tcPr>
-          <w:p>
-            <w:r>
-              <w:t>Pembaruan dan Operasi Harian</w:t>
-            </w:r>
-          </w:p>
-        </w:tc>
-      </w:tr>
-      <w:tr>
-        <w:trPr>
-          <w:jc w:val="center"/>
-        </w:trPr>
-        <w:tc>
-          <w:tcPr>
-            <w:tcW w:w="720" w:type="dxa"/>
-            <w:tcBorders>
-              <w:bottom w:val="single" w:sz="4" w:space="0" w:color="E4EAF0"/>
-            </w:tcBorders>
-            <w:shd w:val="clear" w:color="auto" w:fill="0072BC"/>
-            <w:tcMar>
-              <w:top w:w="80" w:type="dxa"/>
-              <w:left w:w="100" w:type="dxa"/>
-              <w:bottom w:w="80" w:type="dxa"/>
-              <w:right w:w="100" w:type="dxa"/>
-            </w:tcMar>
-          </w:tcPr>
-          <w:p>
-            <w:r>
-              <w:rPr>
-                <w:b/>
-                <w:color w:val="FFFFFF"/>
-              </w:rPr>
-              <w:t>D</w:t>
-            </w:r>
-          </w:p>
-        </w:tc>
-        <w:tc>
-          <w:tcPr>
-            <w:tcW w:w="9360" w:type="dxa"/>
-            <w:tcBorders>
-              <w:bottom w:val="single" w:sz="4" w:space="0" w:color="E4EAF0"/>
-            </w:tcBorders>
-            <w:tcMar>
-              <w:top w:w="80" w:type="dxa"/>
-              <w:left w:w="100" w:type="dxa"/>
-              <w:bottom w:w="80" w:type="dxa"/>
-              <w:right w:w="100" w:type="dxa"/>
-            </w:tcMar>
-          </w:tcPr>
-          <w:p>
-            <w:r>
-              <w:t>Troubleshooting</w:t>
-            </w:r>
-          </w:p>
-        </w:tc>
-      </w:tr>
     </w:tbl>
     <w:p>
       <w:pPr>
@@ -1982,6 +1886,7 @@
               <w:rPr>
                 <w:b/>
               </w:rPr>
+              <w:lastRenderedPageBreak/>
               <w:t>Windows (Command Prompt / CMD)</w:t>
             </w:r>
           </w:p>
@@ -2277,7 +2182,15 @@
             </w:r>
             <w:proofErr w:type="spellEnd"/>
             <w:r>
-              <w:t>; file tersebut tidak ikut saat git clone.</w:t>
+              <w:t xml:space="preserve">; file </w:t>
+            </w:r>
+            <w:proofErr w:type="spellStart"/>
+            <w:r>
+              <w:t>tersebut</w:t>
+            </w:r>
+            <w:proofErr w:type="spellEnd"/>
+            <w:r>
+              <w:t xml:space="preserve"> tidak ikut saat git clone.</w:t>
             </w:r>
           </w:p>
         </w:tc>
@@ -2518,6 +2431,7 @@
           <w:b/>
           <w:color w:val="00875A"/>
         </w:rPr>
+        <w:lastRenderedPageBreak/>
         <w:t xml:space="preserve">Hasil yang diharapkan: </w:t>
       </w:r>
       <w:r>
@@ -3091,6 +3005,7 @@
               <w:rPr>
                 <w:b/>
               </w:rPr>
+              <w:lastRenderedPageBreak/>
               <w:t>Windows (Command Prompt / CMD)</w:t>
             </w:r>
           </w:p>
@@ -3367,7 +3282,6 @@
                 <w:color w:val="FFFFFF"/>
                 <w:sz w:val="28"/>
               </w:rPr>
-              <w:lastRenderedPageBreak/>
               <w:t>8</w:t>
             </w:r>
           </w:p>
@@ -3525,6 +3439,7 @@
                 <w:color w:val="FFFFFF"/>
                 <w:sz w:val="28"/>
               </w:rPr>
+              <w:lastRenderedPageBreak/>
               <w:t>9</w:t>
             </w:r>
           </w:p>
@@ -3935,7 +3850,6 @@
         <w:ind w:left="216"/>
       </w:pPr>
       <w:r>
-        <w:lastRenderedPageBreak/>
         <w:t>Lakukan: Amati log startup dan pastikan backend membaca volume data hasil restore. Hentikan tampilan log dengan Ctrl+C; container tetap berjalan.</w:t>
       </w:r>
     </w:p>
@@ -4281,6 +4195,7 @@
                 <w:color w:val="FFFFFF"/>
                 <w:sz w:val="28"/>
               </w:rPr>
+              <w:lastRenderedPageBreak/>
               <w:t>12</w:t>
             </w:r>
           </w:p>
@@ -4760,7 +4675,6 @@
         <w:rPr>
           <w:b/>
         </w:rPr>
-        <w:lastRenderedPageBreak/>
         <w:t xml:space="preserve">• </w:t>
       </w:r>
       <w:r>
@@ -4850,6 +4764,7 @@
         <w:rPr>
           <w:noProof/>
         </w:rPr>
+        <w:lastRenderedPageBreak/>
         <w:drawing>
           <wp:inline distT="0" distB="0" distL="0" distR="0" wp14:anchorId="018A86F3" wp14:editId="613495CC">
             <wp:extent cx="4751950" cy="2842352"/>
@@ -4959,874 +4874,11 @@
           <w:b/>
           <w:color w:val="00875A"/>
         </w:rPr>
-        <w:lastRenderedPageBreak/>
         <w:t xml:space="preserve">Hasil yang diharapkan: </w:t>
       </w:r>
       <w:r>
         <w:t>Seluruh fungsi utama dapat digunakan tanpa error blocking. Instalasi siap diserahterimakan untuk penggunaan internal.</w:t>
       </w:r>
-    </w:p>
-    <w:p>
-      <w:pPr>
-        <w:pStyle w:val="Heading1"/>
-      </w:pPr>
-      <w:r>
-        <w:t>C. Pembaruan dan Operasi Harian</w:t>
-      </w:r>
-    </w:p>
-    <w:tbl>
-      <w:tblPr>
-        <w:tblW w:w="0" w:type="auto"/>
-        <w:jc w:val="center"/>
-        <w:tblLayout w:type="fixed"/>
-        <w:tblLook w:val="04A0" w:firstRow="1" w:lastRow="0" w:firstColumn="1" w:lastColumn="0" w:noHBand="0" w:noVBand="1"/>
-      </w:tblPr>
-      <w:tblGrid>
-        <w:gridCol w:w="1560"/>
-        <w:gridCol w:w="8520"/>
-      </w:tblGrid>
-      <w:tr>
-        <w:trPr>
-          <w:cantSplit/>
-          <w:jc w:val="center"/>
-        </w:trPr>
-        <w:tc>
-          <w:tcPr>
-            <w:tcW w:w="1560" w:type="dxa"/>
-            <w:tcBorders>
-              <w:bottom w:val="single" w:sz="4" w:space="0" w:color="DDE5EC"/>
-            </w:tcBorders>
-            <w:shd w:val="clear" w:color="auto" w:fill="0072BC"/>
-            <w:tcMar>
-              <w:top w:w="70" w:type="dxa"/>
-              <w:left w:w="40" w:type="dxa"/>
-              <w:bottom w:w="70" w:type="dxa"/>
-              <w:right w:w="40" w:type="dxa"/>
-            </w:tcMar>
-          </w:tcPr>
-          <w:p>
-            <w:pPr>
-              <w:jc w:val="center"/>
-            </w:pPr>
-            <w:r>
-              <w:rPr>
-                <w:b/>
-                <w:color w:val="FFFFFF"/>
-                <w:sz w:val="28"/>
-              </w:rPr>
-              <w:t>14</w:t>
-            </w:r>
-          </w:p>
-        </w:tc>
-        <w:tc>
-          <w:tcPr>
-            <w:tcW w:w="8520" w:type="dxa"/>
-            <w:tcBorders>
-              <w:bottom w:val="single" w:sz="4" w:space="0" w:color="DDE5EC"/>
-            </w:tcBorders>
-            <w:shd w:val="clear" w:color="auto" w:fill="F3F8FC"/>
-            <w:tcMar>
-              <w:top w:w="70" w:type="dxa"/>
-              <w:left w:w="100" w:type="dxa"/>
-              <w:bottom w:w="70" w:type="dxa"/>
-              <w:right w:w="100" w:type="dxa"/>
-            </w:tcMar>
-          </w:tcPr>
-          <w:p>
-            <w:r>
-              <w:rPr>
-                <w:b/>
-                <w:color w:val="12344D"/>
-                <w:sz w:val="24"/>
-              </w:rPr>
-              <w:t>Update aplikasi dari GitHub</w:t>
-            </w:r>
-            <w:r>
-              <w:rPr>
-                <w:color w:val="5B6573"/>
-                <w:sz w:val="19"/>
-              </w:rPr>
-              <w:br/>
-              <w:t>Tarik source dan image prebuilt terbaru. Perintah ini memperbarui aplikasi tanpa build lokal dan tetap menggunakan Docker volumes yang ada.</w:t>
-            </w:r>
-          </w:p>
-        </w:tc>
-      </w:tr>
-    </w:tbl>
-    <w:p>
-      <w:pPr>
-        <w:spacing w:after="20"/>
-      </w:pPr>
-    </w:p>
-    <w:tbl>
-      <w:tblPr>
-        <w:tblW w:w="0" w:type="auto"/>
-        <w:jc w:val="center"/>
-        <w:tblLayout w:type="fixed"/>
-        <w:tblLook w:val="04A0" w:firstRow="1" w:lastRow="0" w:firstColumn="1" w:lastColumn="0" w:noHBand="0" w:noVBand="1"/>
-      </w:tblPr>
-      <w:tblGrid>
-        <w:gridCol w:w="10080"/>
-      </w:tblGrid>
-      <w:tr>
-        <w:trPr>
-          <w:cantSplit/>
-          <w:jc w:val="center"/>
-        </w:trPr>
-        <w:tc>
-          <w:tcPr>
-            <w:tcW w:w="10080" w:type="dxa"/>
-            <w:tcBorders>
-              <w:top w:val="single" w:sz="4" w:space="0" w:color="D8DEE5"/>
-              <w:left w:val="single" w:sz="4" w:space="0" w:color="D8DEE5"/>
-              <w:bottom w:val="single" w:sz="4" w:space="0" w:color="D8DEE5"/>
-              <w:right w:val="single" w:sz="4" w:space="0" w:color="D8DEE5"/>
-            </w:tcBorders>
-            <w:shd w:val="clear" w:color="auto" w:fill="F2F4F7"/>
-            <w:tcMar>
-              <w:top w:w="80" w:type="dxa"/>
-              <w:left w:w="110" w:type="dxa"/>
-              <w:bottom w:w="80" w:type="dxa"/>
-              <w:right w:w="110" w:type="dxa"/>
-            </w:tcMar>
-          </w:tcPr>
-          <w:p>
-            <w:pPr>
-              <w:pStyle w:val="CodeBlock"/>
-            </w:pPr>
-            <w:r>
-              <w:t>git pull origin main</w:t>
-            </w:r>
-          </w:p>
-          <w:p>
-            <w:pPr>
-              <w:pStyle w:val="CodeBlock"/>
-            </w:pPr>
-            <w:r>
-              <w:t>docker compose -f compose.prebuilt.yaml pull</w:t>
-            </w:r>
-          </w:p>
-          <w:p>
-            <w:pPr>
-              <w:pStyle w:val="CodeBlock"/>
-            </w:pPr>
-            <w:r>
-              <w:t>docker compose -f compose.prebuilt.yaml up -d</w:t>
-            </w:r>
-          </w:p>
-          <w:p>
-            <w:pPr>
-              <w:pStyle w:val="CodeBlock"/>
-            </w:pPr>
-            <w:r>
-              <w:t>docker compose -f compose.prebuilt.yaml ps</w:t>
-            </w:r>
-          </w:p>
-        </w:tc>
-      </w:tr>
-    </w:tbl>
-    <w:p>
-      <w:pPr>
-        <w:spacing w:after="40"/>
-      </w:pPr>
-    </w:p>
-    <w:p>
-      <w:pPr>
-        <w:spacing w:after="80"/>
-        <w:ind w:left="216"/>
-      </w:pPr>
-      <w:r>
-        <w:t>Lakukan: Pastikan Git pull dan image pull berhasil sebelum restart. Sebelum update berikutnya, ikuti prosedur backup data perusahaan.</w:t>
-      </w:r>
-    </w:p>
-    <w:tbl>
-      <w:tblPr>
-        <w:tblW w:w="0" w:type="auto"/>
-        <w:jc w:val="center"/>
-        <w:tblLayout w:type="fixed"/>
-        <w:tblLook w:val="04A0" w:firstRow="1" w:lastRow="0" w:firstColumn="1" w:lastColumn="0" w:noHBand="0" w:noVBand="1"/>
-      </w:tblPr>
-      <w:tblGrid>
-        <w:gridCol w:w="1701"/>
-        <w:gridCol w:w="8379"/>
-      </w:tblGrid>
-      <w:tr>
-        <w:trPr>
-          <w:cantSplit/>
-          <w:jc w:val="center"/>
-        </w:trPr>
-        <w:tc>
-          <w:tcPr>
-            <w:tcW w:w="1701" w:type="dxa"/>
-            <w:tcBorders>
-              <w:bottom w:val="single" w:sz="4" w:space="0" w:color="DDE5EC"/>
-            </w:tcBorders>
-            <w:shd w:val="clear" w:color="auto" w:fill="0072BC"/>
-            <w:tcMar>
-              <w:top w:w="70" w:type="dxa"/>
-              <w:left w:w="40" w:type="dxa"/>
-              <w:bottom w:w="70" w:type="dxa"/>
-              <w:right w:w="40" w:type="dxa"/>
-            </w:tcMar>
-          </w:tcPr>
-          <w:p>
-            <w:pPr>
-              <w:jc w:val="center"/>
-            </w:pPr>
-            <w:r>
-              <w:rPr>
-                <w:b/>
-                <w:color w:val="FFFFFF"/>
-                <w:sz w:val="28"/>
-              </w:rPr>
-              <w:t>15</w:t>
-            </w:r>
-          </w:p>
-        </w:tc>
-        <w:tc>
-          <w:tcPr>
-            <w:tcW w:w="8379" w:type="dxa"/>
-            <w:tcBorders>
-              <w:bottom w:val="single" w:sz="4" w:space="0" w:color="DDE5EC"/>
-            </w:tcBorders>
-            <w:shd w:val="clear" w:color="auto" w:fill="F3F8FC"/>
-            <w:tcMar>
-              <w:top w:w="70" w:type="dxa"/>
-              <w:left w:w="100" w:type="dxa"/>
-              <w:bottom w:w="70" w:type="dxa"/>
-              <w:right w:w="100" w:type="dxa"/>
-            </w:tcMar>
-          </w:tcPr>
-          <w:p>
-            <w:r>
-              <w:rPr>
-                <w:b/>
-                <w:color w:val="12344D"/>
-                <w:sz w:val="24"/>
-              </w:rPr>
-              <w:t>Perintah operasi harian</w:t>
-            </w:r>
-            <w:r>
-              <w:rPr>
-                <w:color w:val="5B6573"/>
-                <w:sz w:val="19"/>
-              </w:rPr>
-              <w:br/>
-              <w:t>Gunakan command berikut untuk start, cek status, melihat log, restart, atau stop tanpa menghapus volume.</w:t>
-            </w:r>
-          </w:p>
-        </w:tc>
-      </w:tr>
-    </w:tbl>
-    <w:p>
-      <w:pPr>
-        <w:spacing w:after="20"/>
-      </w:pPr>
-    </w:p>
-    <w:tbl>
-      <w:tblPr>
-        <w:tblStyle w:val="TableGrid"/>
-        <w:tblW w:w="0" w:type="auto"/>
-        <w:jc w:val="center"/>
-        <w:tblLook w:val="04A0" w:firstRow="1" w:lastRow="0" w:firstColumn="1" w:lastColumn="0" w:noHBand="0" w:noVBand="1"/>
-      </w:tblPr>
-      <w:tblGrid>
-        <w:gridCol w:w="5328"/>
-        <w:gridCol w:w="4320"/>
-      </w:tblGrid>
-      <w:tr>
-        <w:trPr>
-          <w:cantSplit/>
-          <w:jc w:val="center"/>
-        </w:trPr>
-        <w:tc>
-          <w:tcPr>
-            <w:tcW w:w="5328" w:type="dxa"/>
-            <w:shd w:val="clear" w:color="auto" w:fill="0072BC"/>
-          </w:tcPr>
-          <w:p>
-            <w:pPr>
-              <w:jc w:val="center"/>
-            </w:pPr>
-            <w:r>
-              <w:rPr>
-                <w:b/>
-                <w:color w:val="FFFFFF"/>
-              </w:rPr>
-              <w:t>Perintah</w:t>
-            </w:r>
-          </w:p>
-        </w:tc>
-        <w:tc>
-          <w:tcPr>
-            <w:tcW w:w="4320" w:type="dxa"/>
-            <w:shd w:val="clear" w:color="auto" w:fill="0072BC"/>
-          </w:tcPr>
-          <w:p>
-            <w:pPr>
-              <w:jc w:val="center"/>
-            </w:pPr>
-            <w:r>
-              <w:rPr>
-                <w:b/>
-                <w:color w:val="FFFFFF"/>
-              </w:rPr>
-              <w:t>Tujuan</w:t>
-            </w:r>
-          </w:p>
-        </w:tc>
-      </w:tr>
-      <w:tr>
-        <w:trPr>
-          <w:cantSplit/>
-          <w:jc w:val="center"/>
-        </w:trPr>
-        <w:tc>
-          <w:tcPr>
-            <w:tcW w:w="5328" w:type="dxa"/>
-            <w:tcMar>
-              <w:top w:w="70" w:type="dxa"/>
-              <w:left w:w="90" w:type="dxa"/>
-              <w:bottom w:w="70" w:type="dxa"/>
-              <w:right w:w="90" w:type="dxa"/>
-            </w:tcMar>
-          </w:tcPr>
-          <w:p>
-            <w:r>
-              <w:t>docker compose -f compose.prebuilt.yaml up -d</w:t>
-            </w:r>
-          </w:p>
-        </w:tc>
-        <w:tc>
-          <w:tcPr>
-            <w:tcW w:w="4320" w:type="dxa"/>
-            <w:tcMar>
-              <w:top w:w="70" w:type="dxa"/>
-              <w:left w:w="90" w:type="dxa"/>
-              <w:bottom w:w="70" w:type="dxa"/>
-              <w:right w:w="90" w:type="dxa"/>
-            </w:tcMar>
-          </w:tcPr>
-          <w:p>
-            <w:r>
-              <w:t>Menjalankan service di background.</w:t>
-            </w:r>
-          </w:p>
-        </w:tc>
-      </w:tr>
-      <w:tr>
-        <w:trPr>
-          <w:cantSplit/>
-          <w:jc w:val="center"/>
-        </w:trPr>
-        <w:tc>
-          <w:tcPr>
-            <w:tcW w:w="5328" w:type="dxa"/>
-            <w:tcMar>
-              <w:top w:w="70" w:type="dxa"/>
-              <w:left w:w="90" w:type="dxa"/>
-              <w:bottom w:w="70" w:type="dxa"/>
-              <w:right w:w="90" w:type="dxa"/>
-            </w:tcMar>
-          </w:tcPr>
-          <w:p>
-            <w:r>
-              <w:t>docker compose -f compose.prebuilt.yaml ps</w:t>
-            </w:r>
-          </w:p>
-        </w:tc>
-        <w:tc>
-          <w:tcPr>
-            <w:tcW w:w="4320" w:type="dxa"/>
-            <w:tcMar>
-              <w:top w:w="70" w:type="dxa"/>
-              <w:left w:w="90" w:type="dxa"/>
-              <w:bottom w:w="70" w:type="dxa"/>
-              <w:right w:w="90" w:type="dxa"/>
-            </w:tcMar>
-          </w:tcPr>
-          <w:p>
-            <w:r>
-              <w:t>Melihat status seluruh container.</w:t>
-            </w:r>
-          </w:p>
-        </w:tc>
-      </w:tr>
-      <w:tr>
-        <w:trPr>
-          <w:cantSplit/>
-          <w:jc w:val="center"/>
-        </w:trPr>
-        <w:tc>
-          <w:tcPr>
-            <w:tcW w:w="5328" w:type="dxa"/>
-            <w:tcMar>
-              <w:top w:w="70" w:type="dxa"/>
-              <w:left w:w="90" w:type="dxa"/>
-              <w:bottom w:w="70" w:type="dxa"/>
-              <w:right w:w="90" w:type="dxa"/>
-            </w:tcMar>
-          </w:tcPr>
-          <w:p>
-            <w:r>
-              <w:t>docker compose -f compose.prebuilt.yaml logs -f frontend backend documentserver ollama</w:t>
-            </w:r>
-          </w:p>
-        </w:tc>
-        <w:tc>
-          <w:tcPr>
-            <w:tcW w:w="4320" w:type="dxa"/>
-            <w:tcMar>
-              <w:top w:w="70" w:type="dxa"/>
-              <w:left w:w="90" w:type="dxa"/>
-              <w:bottom w:w="70" w:type="dxa"/>
-              <w:right w:w="90" w:type="dxa"/>
-            </w:tcMar>
-          </w:tcPr>
-          <w:p>
-            <w:r>
-              <w:t>Memantau log service.</w:t>
-            </w:r>
-          </w:p>
-        </w:tc>
-      </w:tr>
-      <w:tr>
-        <w:trPr>
-          <w:cantSplit/>
-          <w:jc w:val="center"/>
-        </w:trPr>
-        <w:tc>
-          <w:tcPr>
-            <w:tcW w:w="5328" w:type="dxa"/>
-            <w:tcMar>
-              <w:top w:w="70" w:type="dxa"/>
-              <w:left w:w="90" w:type="dxa"/>
-              <w:bottom w:w="70" w:type="dxa"/>
-              <w:right w:w="90" w:type="dxa"/>
-            </w:tcMar>
-          </w:tcPr>
-          <w:p>
-            <w:r>
-              <w:t>docker compose -f compose.prebuilt.yaml restart</w:t>
-            </w:r>
-          </w:p>
-        </w:tc>
-        <w:tc>
-          <w:tcPr>
-            <w:tcW w:w="4320" w:type="dxa"/>
-            <w:tcMar>
-              <w:top w:w="70" w:type="dxa"/>
-              <w:left w:w="90" w:type="dxa"/>
-              <w:bottom w:w="70" w:type="dxa"/>
-              <w:right w:w="90" w:type="dxa"/>
-            </w:tcMar>
-          </w:tcPr>
-          <w:p>
-            <w:r>
-              <w:t>Restart seluruh service.</w:t>
-            </w:r>
-          </w:p>
-        </w:tc>
-      </w:tr>
-      <w:tr>
-        <w:trPr>
-          <w:cantSplit/>
-          <w:jc w:val="center"/>
-        </w:trPr>
-        <w:tc>
-          <w:tcPr>
-            <w:tcW w:w="5328" w:type="dxa"/>
-            <w:tcMar>
-              <w:top w:w="70" w:type="dxa"/>
-              <w:left w:w="90" w:type="dxa"/>
-              <w:bottom w:w="70" w:type="dxa"/>
-              <w:right w:w="90" w:type="dxa"/>
-            </w:tcMar>
-          </w:tcPr>
-          <w:p>
-            <w:r>
-              <w:t>docker compose -f compose.prebuilt.yaml stop</w:t>
-            </w:r>
-          </w:p>
-        </w:tc>
-        <w:tc>
-          <w:tcPr>
-            <w:tcW w:w="4320" w:type="dxa"/>
-            <w:tcMar>
-              <w:top w:w="70" w:type="dxa"/>
-              <w:left w:w="90" w:type="dxa"/>
-              <w:bottom w:w="70" w:type="dxa"/>
-              <w:right w:w="90" w:type="dxa"/>
-            </w:tcMar>
-          </w:tcPr>
-          <w:p>
-            <w:r>
-              <w:t>Menghentikan service tanpa menghapus volume.</w:t>
-            </w:r>
-          </w:p>
-        </w:tc>
-      </w:tr>
-    </w:tbl>
-    <w:p>
-      <w:pPr>
-        <w:spacing w:after="40"/>
-      </w:pPr>
-    </w:p>
-    <w:p>
-      <w:pPr>
-        <w:pStyle w:val="Heading1"/>
-      </w:pPr>
-      <w:r>
-        <w:t>D. Troubleshooting</w:t>
-      </w:r>
-    </w:p>
-    <w:tbl>
-      <w:tblPr>
-        <w:tblStyle w:val="TableGrid"/>
-        <w:tblW w:w="0" w:type="auto"/>
-        <w:jc w:val="center"/>
-        <w:tblLook w:val="04A0" w:firstRow="1" w:lastRow="0" w:firstColumn="1" w:lastColumn="0" w:noHBand="0" w:noVBand="1"/>
-      </w:tblPr>
-      <w:tblGrid>
-        <w:gridCol w:w="3024"/>
-        <w:gridCol w:w="6624"/>
-      </w:tblGrid>
-      <w:tr>
-        <w:trPr>
-          <w:cantSplit/>
-          <w:jc w:val="center"/>
-        </w:trPr>
-        <w:tc>
-          <w:tcPr>
-            <w:tcW w:w="3024" w:type="dxa"/>
-            <w:shd w:val="clear" w:color="auto" w:fill="0072BC"/>
-          </w:tcPr>
-          <w:p>
-            <w:pPr>
-              <w:jc w:val="center"/>
-            </w:pPr>
-            <w:r>
-              <w:rPr>
-                <w:b/>
-                <w:color w:val="FFFFFF"/>
-              </w:rPr>
-              <w:t>Masalah</w:t>
-            </w:r>
-          </w:p>
-        </w:tc>
-        <w:tc>
-          <w:tcPr>
-            <w:tcW w:w="6624" w:type="dxa"/>
-            <w:shd w:val="clear" w:color="auto" w:fill="0072BC"/>
-          </w:tcPr>
-          <w:p>
-            <w:pPr>
-              <w:jc w:val="center"/>
-            </w:pPr>
-            <w:r>
-              <w:rPr>
-                <w:b/>
-                <w:color w:val="FFFFFF"/>
-              </w:rPr>
-              <w:t>Langkah pemeriksaan</w:t>
-            </w:r>
-          </w:p>
-        </w:tc>
-      </w:tr>
-      <w:tr>
-        <w:trPr>
-          <w:cantSplit/>
-          <w:jc w:val="center"/>
-        </w:trPr>
-        <w:tc>
-          <w:tcPr>
-            <w:tcW w:w="3024" w:type="dxa"/>
-            <w:tcMar>
-              <w:top w:w="70" w:type="dxa"/>
-              <w:left w:w="90" w:type="dxa"/>
-              <w:bottom w:w="70" w:type="dxa"/>
-              <w:right w:w="90" w:type="dxa"/>
-            </w:tcMar>
-          </w:tcPr>
-          <w:p>
-            <w:r>
-              <w:t>Docker daemon tidak terhubung</w:t>
-            </w:r>
-          </w:p>
-        </w:tc>
-        <w:tc>
-          <w:tcPr>
-            <w:tcW w:w="6624" w:type="dxa"/>
-            <w:tcMar>
-              <w:top w:w="70" w:type="dxa"/>
-              <w:left w:w="90" w:type="dxa"/>
-              <w:bottom w:w="70" w:type="dxa"/>
-              <w:right w:w="90" w:type="dxa"/>
-            </w:tcMar>
-          </w:tcPr>
-          <w:p>
-            <w:r>
-              <w:t>Buka Docker Desktop dan tunggu status Running.</w:t>
-            </w:r>
-          </w:p>
-        </w:tc>
-      </w:tr>
-      <w:tr>
-        <w:trPr>
-          <w:cantSplit/>
-          <w:jc w:val="center"/>
-        </w:trPr>
-        <w:tc>
-          <w:tcPr>
-            <w:tcW w:w="3024" w:type="dxa"/>
-            <w:tcMar>
-              <w:top w:w="70" w:type="dxa"/>
-              <w:left w:w="90" w:type="dxa"/>
-              <w:bottom w:w="70" w:type="dxa"/>
-              <w:right w:w="90" w:type="dxa"/>
-            </w:tcMar>
-          </w:tcPr>
-          <w:p>
-            <w:r>
-              <w:t>Port sudah digunakan</w:t>
-            </w:r>
-          </w:p>
-        </w:tc>
-        <w:tc>
-          <w:tcPr>
-            <w:tcW w:w="6624" w:type="dxa"/>
-            <w:tcMar>
-              <w:top w:w="70" w:type="dxa"/>
-              <w:left w:w="90" w:type="dxa"/>
-              <w:bottom w:w="70" w:type="dxa"/>
-              <w:right w:w="90" w:type="dxa"/>
-            </w:tcMar>
-          </w:tcPr>
-          <w:p>
-            <w:r>
-              <w:t>Ubah port pada .env lalu jalankan docker compose up -d --build kembali.</w:t>
-            </w:r>
-          </w:p>
-        </w:tc>
-      </w:tr>
-      <w:tr>
-        <w:trPr>
-          <w:cantSplit/>
-          <w:jc w:val="center"/>
-        </w:trPr>
-        <w:tc>
-          <w:tcPr>
-            <w:tcW w:w="3024" w:type="dxa"/>
-            <w:tcMar>
-              <w:top w:w="70" w:type="dxa"/>
-              <w:left w:w="90" w:type="dxa"/>
-              <w:bottom w:w="70" w:type="dxa"/>
-              <w:right w:w="90" w:type="dxa"/>
-            </w:tcMar>
-          </w:tcPr>
-          <w:p>
-            <w:r>
-              <w:lastRenderedPageBreak/>
-              <w:t>Backend belum sehat</w:t>
-            </w:r>
-          </w:p>
-        </w:tc>
-        <w:tc>
-          <w:tcPr>
-            <w:tcW w:w="6624" w:type="dxa"/>
-            <w:tcMar>
-              <w:top w:w="70" w:type="dxa"/>
-              <w:left w:w="90" w:type="dxa"/>
-              <w:bottom w:w="70" w:type="dxa"/>
-              <w:right w:w="90" w:type="dxa"/>
-            </w:tcMar>
-          </w:tcPr>
-          <w:p>
-            <w:r>
-              <w:t>Jalankan docker compose logs backend. Startup pertama dapat lebih lama ketika index dibangun.</w:t>
-            </w:r>
-          </w:p>
-        </w:tc>
-      </w:tr>
-      <w:tr>
-        <w:trPr>
-          <w:cantSplit/>
-          <w:jc w:val="center"/>
-        </w:trPr>
-        <w:tc>
-          <w:tcPr>
-            <w:tcW w:w="3024" w:type="dxa"/>
-            <w:tcMar>
-              <w:top w:w="70" w:type="dxa"/>
-              <w:left w:w="90" w:type="dxa"/>
-              <w:bottom w:w="70" w:type="dxa"/>
-              <w:right w:w="90" w:type="dxa"/>
-            </w:tcMar>
-          </w:tcPr>
-          <w:p>
-            <w:r>
-              <w:t>Preview PDF gagal</w:t>
-            </w:r>
-          </w:p>
-        </w:tc>
-        <w:tc>
-          <w:tcPr>
-            <w:tcW w:w="6624" w:type="dxa"/>
-            <w:tcMar>
-              <w:top w:w="70" w:type="dxa"/>
-              <w:left w:w="90" w:type="dxa"/>
-              <w:bottom w:w="70" w:type="dxa"/>
-              <w:right w:w="90" w:type="dxa"/>
-            </w:tcMar>
-          </w:tcPr>
-          <w:p>
-            <w:r>
-              <w:t>Periksa log backend dan kapasitas disk.</w:t>
-            </w:r>
-          </w:p>
-        </w:tc>
-      </w:tr>
-      <w:tr>
-        <w:trPr>
-          <w:cantSplit/>
-          <w:jc w:val="center"/>
-        </w:trPr>
-        <w:tc>
-          <w:tcPr>
-            <w:tcW w:w="3024" w:type="dxa"/>
-            <w:tcMar>
-              <w:top w:w="70" w:type="dxa"/>
-              <w:left w:w="90" w:type="dxa"/>
-              <w:bottom w:w="70" w:type="dxa"/>
-              <w:right w:w="90" w:type="dxa"/>
-            </w:tcMar>
-          </w:tcPr>
-          <w:p>
-            <w:r>
-              <w:t>Editor tidak terbuka</w:t>
-            </w:r>
-          </w:p>
-        </w:tc>
-        <w:tc>
-          <w:tcPr>
-            <w:tcW w:w="6624" w:type="dxa"/>
-            <w:tcMar>
-              <w:top w:w="70" w:type="dxa"/>
-              <w:left w:w="90" w:type="dxa"/>
-              <w:bottom w:w="70" w:type="dxa"/>
-              <w:right w:w="90" w:type="dxa"/>
-            </w:tcMar>
-          </w:tcPr>
-          <w:p>
-            <w:r>
-              <w:t>Periksa docker compose ps documentserver dan lognya. Apple Silicon menjalankan ONLYOFFICE melalui emulasi amd64.</w:t>
-            </w:r>
-          </w:p>
-        </w:tc>
-      </w:tr>
-      <w:tr>
-        <w:trPr>
-          <w:cantSplit/>
-          <w:jc w:val="center"/>
-        </w:trPr>
-        <w:tc>
-          <w:tcPr>
-            <w:tcW w:w="3024" w:type="dxa"/>
-            <w:tcMar>
-              <w:top w:w="70" w:type="dxa"/>
-              <w:left w:w="90" w:type="dxa"/>
-              <w:bottom w:w="70" w:type="dxa"/>
-              <w:right w:w="90" w:type="dxa"/>
-            </w:tcMar>
-          </w:tcPr>
-          <w:p>
-            <w:r>
-              <w:t>AI lambat / tidak muncul</w:t>
-            </w:r>
-          </w:p>
-        </w:tc>
-        <w:tc>
-          <w:tcPr>
-            <w:tcW w:w="6624" w:type="dxa"/>
-            <w:tcMar>
-              <w:top w:w="70" w:type="dxa"/>
-              <w:left w:w="90" w:type="dxa"/>
-              <w:bottom w:w="70" w:type="dxa"/>
-              <w:right w:w="90" w:type="dxa"/>
-            </w:tcMar>
-          </w:tcPr>
-          <w:p>
-            <w:r>
-              <w:t>Periksa docker compose exec ollama ollama list dan log Ollama.</w:t>
-            </w:r>
-          </w:p>
-        </w:tc>
-      </w:tr>
-      <w:tr>
-        <w:trPr>
-          <w:cantSplit/>
-          <w:jc w:val="center"/>
-        </w:trPr>
-        <w:tc>
-          <w:tcPr>
-            <w:tcW w:w="3024" w:type="dxa"/>
-            <w:tcMar>
-              <w:top w:w="70" w:type="dxa"/>
-              <w:left w:w="90" w:type="dxa"/>
-              <w:bottom w:w="70" w:type="dxa"/>
-              <w:right w:w="90" w:type="dxa"/>
-            </w:tcMar>
-          </w:tcPr>
-          <w:p>
-            <w:r>
-              <w:t>Data tidak muncul setelah migrasi</w:t>
-            </w:r>
-          </w:p>
-        </w:tc>
-        <w:tc>
-          <w:tcPr>
-            <w:tcW w:w="6624" w:type="dxa"/>
-            <w:tcMar>
-              <w:top w:w="70" w:type="dxa"/>
-              <w:left w:w="90" w:type="dxa"/>
-              <w:bottom w:w="70" w:type="dxa"/>
-              <w:right w:w="90" w:type="dxa"/>
-            </w:tcMar>
-          </w:tcPr>
-          <w:p>
-            <w:r>
-              <w:t>Periksa nama volume dan isi arsip backup; jangan membuat volume kosong setelah restore selesai.</w:t>
-            </w:r>
-          </w:p>
-        </w:tc>
-      </w:tr>
-      <w:tr>
-        <w:tc>
-          <w:tcPr>
-            <w:tcW w:type="dxa" w:w="3024"/>
-          </w:tcPr>
-          <w:p>
-            <w:r>
-              <w:t>Build lokal gagal pada npm/pip</w:t>
-            </w:r>
-          </w:p>
-        </w:tc>
-        <w:tc>
-          <w:tcPr>
-            <w:tcW w:type="dxa" w:w="6624"/>
-          </w:tcPr>
-          <w:p>
-            <w:r>
-              <w:t>Jangan gunakan --build. Jalankan docker compose -f compose.prebuilt.yaml pull lalu up -d.</w:t>
-            </w:r>
-          </w:p>
-        </w:tc>
-      </w:tr>
-    </w:tbl>
-    <w:p>
-      <w:pPr>
-        <w:spacing w:after="40"/>
-      </w:pPr>
     </w:p>
     <w:sectPr>
       <w:headerReference w:type="default" r:id="rId12"/>

</xml_diff>